<commit_message>
docs(credits): méthode et dossier au conseil régénérés (C-X19, règle 8.3, DC10)
</commit_message>
<xml_diff>
--- a/livraison/Méthode OpenNAT Crédits v1.docx
+++ b/livraison/Méthode OpenNAT Crédits v1.docx
@@ -2483,6 +2483,18 @@
     </w:p>
     <w:p>
       <w:pPr>
+        <w:spacing w:before="57" w:after="227" w:line="288" w:lineRule="auto"/>
+      </w:pPr>
+      <w:r>
+        <w:rPr>
+          <w:rFonts w:ascii="Calibri" w:hAnsi="Calibri"/>
+          <w:sz w:val="20"/>
+        </w:rPr>
+        <w:t>Dans tous les calculs du présent chapitre, la difficulté de création ou d'amélioration d'OpenNAT 1 (convention C-T7) est neutralisée : le risque d'échec qu'elle exprime est porté par le constat avant émission et par la réserve (convention C-X19).</w:t>
+      </w:r>
+    </w:p>
+    <w:p>
+      <w:pPr>
         <w:keepNext/>
         <w:spacing w:before="57" w:after="227" w:line="288" w:lineRule="auto"/>
       </w:pPr>
@@ -2933,7 +2945,7 @@
           <w:rFonts w:ascii="Calibri" w:hAnsi="Calibri"/>
           <w:sz w:val="20"/>
         </w:rPr>
-        <w:t>La maturation des unités créées continue de suivre la courbe de la convention C-M1, appliquée au type et à l'état relevés.</w:t>
+        <w:t>La maturation des unités créées continue de suivre la courbe de la convention C-M1, avec le délai de maturité de l'état prévu, qui court depuis la plantation : l'état relevé fixe la valeur visée, il ne remet pas l'horloge à zéro. Sans cette règle, un meilleur état relevé, dont le délai de maturité est plus long dans OpenNAT 1, ferait baisser la valeur des premières années.</w:t>
       </w:r>
     </w:p>
     <w:p>
@@ -6102,6 +6114,32 @@
           <w:b/>
           <w:sz w:val="20"/>
         </w:rPr>
+        <w:t>C-X19</w:t>
+      </w:r>
+    </w:p>
+    <w:p>
+      <w:pPr>
+        <w:spacing w:before="57" w:after="227" w:line="288" w:lineRule="auto"/>
+      </w:pPr>
+      <w:r>
+        <w:rPr>
+          <w:rFonts w:ascii="Calibri" w:hAnsi="Calibri"/>
+          <w:sz w:val="20"/>
+        </w:rPr>
+        <w:t>Catégorie : source muette. Dans les calculs de crédits (état projet prévu, variante d'obligations, états relevés), la difficulté de création ou d'amélioration de la convention C-T7 est neutralisée : D vaut 1. Dans OpenNAT 1, la difficulté multiplie la valeur cible d'un milieu créé pour exprimer son risque d'échec : c'est une espérance, adaptée à une attestation au permis. Pour les crédits, le risque d'échec est déjà porté par le constat avant émission (aucun crédit sans état relevé) et par la réserve (C-X11). Appliquer aussi la difficulté le compterait deux fois et rendrait inéligible toute restauration difficile, même réussie : sur l'exemple d'une culture restaurée en prairie de fauche (difficulté 0,33), le gain prévu devient négatif. Convention ajoutée au lot 2, après le premier calcul du moteur ; soumise au conseil (décision DC10).</w:t>
+      </w:r>
+    </w:p>
+    <w:p>
+      <w:pPr>
+        <w:keepNext/>
+        <w:spacing w:before="57" w:after="227" w:line="288" w:lineRule="auto"/>
+      </w:pPr>
+      <w:r>
+        <w:rPr>
+          <w:rFonts w:ascii="Calibri" w:hAnsi="Calibri"/>
+          <w:b/>
+          <w:sz w:val="20"/>
+        </w:rPr>
         <w:t>C-X10</w:t>
       </w:r>
     </w:p>

</xml_diff>

<commit_message>
feat(credits): ajustements A, B, C (certification non déduite et publiée, relevé du Biodiversity Partner sous contrôle, calendrier calé sur la certification) ; DC11
</commit_message>
<xml_diff>
--- a/livraison/Méthode OpenNAT Crédits v1.docx
+++ b/livraison/Méthode OpenNAT Crédits v1.docx
@@ -4,49 +4,8 @@
   <w:body>
     <w:p>
       <w:pPr>
-        <w:keepNext/>
-        <w:spacing w:before="0" w:after="113"/>
-        <w:jc w:val="center"/>
-      </w:pPr>
-      <w:r>
-        <w:drawing>
-          <wp:inline xmlns:a="http://schemas.openxmlformats.org/drawingml/2006/main" xmlns:pic="http://schemas.openxmlformats.org/drawingml/2006/picture">
-            <wp:extent cx="1800000" cy="407571"/>
-            <wp:docPr id="1" name="Picture 1"/>
-            <wp:cNvGraphicFramePr>
-              <a:graphicFrameLocks noChangeAspect="1"/>
-            </wp:cNvGraphicFramePr>
-            <a:graphic>
-              <a:graphicData uri="http://schemas.openxmlformats.org/drawingml/2006/picture">
-                <pic:pic>
-                  <pic:nvPicPr>
-                    <pic:cNvPr id="0" name="opennat_logo.png"/>
-                    <pic:cNvPicPr/>
-                  </pic:nvPicPr>
-                  <pic:blipFill>
-                    <a:blip r:embed="rId13"/>
-                    <a:stretch>
-                      <a:fillRect/>
-                    </a:stretch>
-                  </pic:blipFill>
-                  <pic:spPr>
-                    <a:xfrm>
-                      <a:off x="0" y="0"/>
-                      <a:ext cx="1800000" cy="407571"/>
-                    </a:xfrm>
-                    <a:prstGeom prst="rect"/>
-                  </pic:spPr>
-                </pic:pic>
-              </a:graphicData>
-            </a:graphic>
-          </wp:inline>
-        </w:drawing>
-      </w:r>
-    </w:p>
-    <w:p>
-      <w:pPr>
         <w:pStyle w:val="Title"/>
-        <w:spacing w:before="113" w:after="340"/>
+        <w:spacing w:before="227" w:after="340"/>
       </w:pPr>
       <w:r>
         <w:rPr>
@@ -2402,7 +2361,7 @@
     <w:p>
       <w:pPr>
         <w:pStyle w:val="ListBullet"/>
-        <w:keepNext/>
+        <w:keepNext w:val="0"/>
         <w:spacing w:before="45" w:after="79" w:line="288" w:lineRule="auto"/>
         <w:jc w:val="both"/>
       </w:pPr>
@@ -2416,21 +2375,6 @@
     </w:p>
     <w:p>
       <w:pPr>
-        <w:pStyle w:val="ListBullet"/>
-        <w:keepNext w:val="0"/>
-        <w:spacing w:before="45" w:after="79" w:line="288" w:lineRule="auto"/>
-        <w:jc w:val="both"/>
-      </w:pPr>
-      <w:r>
-        <w:rPr>
-          <w:rFonts w:ascii="Calibri" w:hAnsi="Calibri"/>
-          <w:sz w:val="20"/>
-        </w:rPr>
-        <w:t>objectifs de certification : quand le projet est candidat à une certification qui exige un niveau de gain (par exemple le niveau 2 d'OpenNAT dans une certification Effinature), la part du gain que ce niveau exige.</w:t>
-      </w:r>
-    </w:p>
-    <w:p>
-      <w:pPr>
         <w:spacing w:before="57" w:after="227" w:line="288" w:lineRule="auto"/>
       </w:pPr>
       <w:r>
@@ -2450,6 +2394,18 @@
           <w:rFonts w:ascii="Calibri" w:hAnsi="Calibri"/>
           <w:sz w:val="20"/>
         </w:rPr>
+        <w:t>Le niveau de gain visé par une certification volontaire (Effinature, Effinature HVE, Biodiversity Performance Score ou autre) n'est pas une obligation et ne se déduit pas. Le porteur déclare la certification obtenue ou demandée, et chaque lot émis la publie (convention C-X8).</w:t>
+      </w:r>
+    </w:p>
+    <w:p>
+      <w:pPr>
+        <w:spacing w:before="57" w:after="227" w:line="288" w:lineRule="auto"/>
+      </w:pPr>
+      <w:r>
+        <w:rPr>
+          <w:rFonts w:ascii="Calibri" w:hAnsi="Calibri"/>
+          <w:sz w:val="20"/>
+        </w:rPr>
         <w:t>Pour un projet sans aucune obligation, la variante d'obligations est le scénario de référence.</w:t>
       </w:r>
     </w:p>
@@ -2742,7 +2698,7 @@
           <w:rFonts w:ascii="Calibri" w:hAnsi="Calibri"/>
           <w:sz w:val="20"/>
         </w:rPr>
-        <w:t>Le porteur fait relever le site aux années 1, 3, 5, 10, 15, 20, 30, 40 et 50 comptées depuis la fin des travaux de restauration (convention C-X12). Il peut faire relever le site à toute autre date, à ses frais. Un relevé n'est retenu pour une vérification que s'il a moins de douze mois.</w:t>
+        <w:t>Le porteur fait relever le site aux années 1, 3, 5, 10, 15, 20, 30, 40 et 50 comptées depuis la fin des travaux de restauration (convention C-X12). Si le site fait l'objet d'un suivi périodique par ailleurs, notamment une certification Effinature HVE, le porteur peut déclarer à la validation un calendrier propre qui fait coïncider relevés et contrôles : premier relevé au plus tard à l'année 3, cinq ans au plus entre deux relevés, dernier relevé à l'année 50. Le calendrier déclaré remplace alors celui du présent alinéa. Il peut faire relever le site à toute autre date, à ses frais. Un relevé n'est retenu pour une vérification que s'il a moins de douze mois.</w:t>
       </w:r>
     </w:p>
     <w:p>
@@ -2871,7 +2827,7 @@
           <w:rFonts w:ascii="Calibri" w:hAnsi="Calibri"/>
           <w:sz w:val="20"/>
         </w:rPr>
-        <w:t>Le relevé est fait par un écologue inscrit sur la liste du registre, qui n'a ni conçu ni réalisé le projet et n'a aucun lien d'intérêt avec le porteur (convention C-X13).</w:t>
+        <w:t>Le relevé est fait par un écologue inscrit sur la liste du registre, qui n'a aucun intérêt au nombre de crédits émis. Il peut avoir conçu le projet ou accompagner le porteur, notamment comme Biodiversity Partner d'une opération certifiée ; le vérificateur contrôle alors le relevé sur place à chaque vérification, par échantillonnage (9.3, convention C-X13).</w:t>
       </w:r>
     </w:p>
     <w:p>
@@ -2952,7 +2908,6 @@
       <w:pPr>
         <w:pStyle w:val="Heading1"/>
         <w:keepNext/>
-        <w:pageBreakBefore/>
         <w:spacing w:before="397" w:after="170"/>
       </w:pPr>
       <w:r>
@@ -3172,7 +3127,7 @@
           <w:rFonts w:ascii="Calibri" w:hAnsi="Calibri"/>
           <w:sz w:val="20"/>
         </w:rPr>
-        <w:t>visite le site, au moins une fois sur deux vérifications et obligatoirement aux années 5, 20 et 50 ;</w:t>
+        <w:t>visite le site, au moins une fois sur deux vérifications et obligatoirement aux années 5, 20 et 50 ; à chaque vérification si l'écologue a conçu le projet ou accompagne le porteur : il relève alors lui-même au moins une unité sur cinq, et au moins deux, tirées au sort parmi celles qui portent le plus de valeur, et relève toutes les unités si l'écart dépasse une classe de la grille d'état sur plus d'une unité contrôlée (convention C-X13) ;</w:t>
       </w:r>
     </w:p>
     <w:p>
@@ -3652,7 +3607,6 @@
       <w:pPr>
         <w:pStyle w:val="Heading1"/>
         <w:keepNext/>
-        <w:pageBreakBefore/>
         <w:spacing w:before="397" w:after="170"/>
       </w:pPr>
       <w:r>
@@ -6060,7 +6014,7 @@
           <w:rFonts w:ascii="Calibri" w:hAnsi="Calibri"/>
           <w:sz w:val="20"/>
         </w:rPr>
-        <w:t>Catégorie : source muette. Chaque obligation se traduit, unité par unité, par la plus petite configuration conforme du plan masse du projet, en gardant ses types d'habitat ; une obligation exprimée en niveau de gain s'ajoute au scénario de référence. Le gain créditable se mesure au-dessus du plus grand des deux, tirage par tirage. Aucune source ne traite la soustraction d'obligations d'urbanisme d'un gain de biodiversité ; VNF et PVN exigent seulement que les activités créditées ne soient pas imposées par la loi. La règle fait entrer les objectifs de certification dans les obligations pour qu'un même gain ne soit pas à la fois exigé par une certification et vendu en crédits.</w:t>
+        <w:t>Catégorie : source muette. Chaque obligation se traduit, unité par unité, par la plus petite configuration conforme du plan masse du projet, en gardant ses types d'habitat ; une obligation exprimée en niveau de gain s'ajoute au scénario de référence. Le gain créditable se mesure au-dessus du plus grand des deux, tirage par tirage. Aucune source ne traite la soustraction d'obligations d'urbanisme d'un gain de biodiversité ; VNF et PVN exigent seulement que les activités créditées ne soient pas imposées par la loi. Seules comptent les obligations légales, réglementaires et contractuelles (urbanisme, autorisations, mesures d'évitement, de réduction et de compensation, cahiers des charges et conventions qui imposent des aménagements). Le niveau de gain visé par une certification volontaire (par exemple Effinature, Effinature HVE ou le Biodiversity Performance Score) n'est pas une obligation : la certification atteste un résultat sans en acquérir le gain ni le céder à personne, et le maître d'ouvrage reste libre de la demander ou non. Le compter comme obligation priverait de crédits presque toutes les opérations certifiées, qui visent justement un niveau de gain. En contrepartie, le lot de crédits publie la certification obtenue par l'opération, pour que l'acheteur sache que le même gain a aussi servi à l'obtenir. Règle modifiée à la suite de l'offre d'IRICE (ajustement A), retenue par Cédric PLANTAZ le 24/10/2026 ; soumise au conseil (décision DC7).</w:t>
       </w:r>
     </w:p>
     <w:p>
@@ -6126,7 +6080,7 @@
           <w:rFonts w:ascii="Calibri" w:hAnsi="Calibri"/>
           <w:sz w:val="20"/>
         </w:rPr>
-        <w:t>Catégorie : source muette. Dans les calculs de crédits (état projet prévu, variante d'obligations, états relevés), la difficulté de création ou d'amélioration de la convention C-T7 est neutralisée : D vaut 1. Dans OpenNAT 1, la difficulté multiplie la valeur cible d'un milieu créé pour exprimer son risque d'échec : c'est une espérance, adaptée à une attestation au permis. Pour les crédits, le risque d'échec est déjà porté par le constat avant émission (aucun crédit sans état relevé) et par la réserve (C-X11). Appliquer aussi la difficulté le compterait deux fois et rendrait inéligible toute restauration difficile, même réussie : sur l'exemple d'une culture restaurée en prairie de fauche (difficulté 0,33), le gain prévu devient négatif. Convention ajoutée au lot 2, après le premier calcul du moteur ; soumise au conseil (décision DC10).</w:t>
+        <w:t>Catégorie : source muette. Dans les calculs de crédits (état projet prévu, variante d'obligations, états relevés), la difficulté de création ou d'amélioration de la convention C-T7 est neutralisée : D vaut 1. Dans OpenNAT 1, la difficulté multiplie la valeur cible d'un milieu créé pour exprimer son risque d'échec : c'est une espérance, adaptée à une attestation au permis. Pour les crédits, le risque d'échec est déjà porté par le constat avant émission (aucun crédit sans état relevé) et par la réserve (C-X11). Appliquer aussi la difficulté le compterait deux fois et rendrait inéligible toute restauration difficile, même réussie : sur l'exemple d'une culture restaurée en prairie de fauche (difficulté 0,33), le gain prévu devient négatif. Convention ajoutée au lot 2, après le premier calcul du moteur, retenue par Cédric PLANTAZ le 24/10/2026 ; soumise au conseil (décision DC10).</w:t>
       </w:r>
     </w:p>
     <w:p>
@@ -6218,7 +6172,7 @@
           <w:rFonts w:ascii="Calibri" w:hAnsi="Calibri"/>
           <w:sz w:val="20"/>
         </w:rPr>
-        <w:t>Catégorie : convention de transposition. Relevés aux années 1, 3, 5, 10, 15, 20, 30, 40 et 50 depuis la fin des travaux de restauration ; revalidation tous les dix ans. Sources : BNG, calendriers locaux des plans de gestion et de suivi (par exemple années 1, 3, 5, 10, 15, 20, 25, 30, ou 2, 5, 10, 15, 20, 25, 30), source secondaire concordante ; VNF §5.2.5, PVN et BCA (principe 10), vérification au moins tous les cinq ans ; PVN, réévaluation de la référence et de l'additionnalité au moins tous les dix ans ; A2024, fréquence de suivi cohérente avec le temps de réponse des milieux. Le calendrier est serré au début, quand la maturation se joue et que les échecs se produisent, et suit la courbe de C-M1 ; il dépasse le minimum de cinq ans des standards jusqu'à l'année 20, puis l'espace à dix ans, quand les milieux sont mûrs. Une inversion de cette pratique est à surveiller : un écart de dix ans entre deux relevés laisse une perte non vue plus longtemps qu'en standard de marché, ce que compense la règle du score le plus faible (C-X14).</w:t>
+        <w:t>Catégorie : convention de transposition. Relevés aux années 1, 3, 5, 10, 15, 20, 30, 40 et 50 depuis la fin des travaux de restauration ; revalidation tous les dix ans. Sources : BNG, calendriers locaux des plans de gestion et de suivi (par exemple années 1, 3, 5, 10, 15, 20, 25, 30, ou 2, 5, 10, 15, 20, 25, 30), source secondaire concordante ; VNF §5.2.5, PVN et BCA (principe 10), vérification au moins tous les cinq ans ; PVN, réévaluation de la référence et de l'additionnalité au moins tous les dix ans ; A2024, fréquence de suivi cohérente avec le temps de réponse des milieux. Le calendrier est serré au début, quand la maturation se joue et que les échecs se produisent, et suit la courbe de C-M1 ; il dépasse le minimum de cinq ans des standards jusqu'à l'année 20, puis l'espace à dix ans, quand les milieux sont mûrs. Une inversion de cette pratique est à surveiller : un écart de dix ans entre deux relevés laisse une perte non vue plus longtemps qu'en standard de marché, ce que compense la règle du score le plus faible (C-X14). Un projet dont le site fait l'objet d'un suivi périodique par ailleurs, notamment une certification en exploitation (Effinature HVE), peut déclarer à la validation un calendrier propre qui fait coïncider relevés et contrôles : le premier relevé a lieu au plus tard à l'année 3, deux relevés ne sont jamais séparés de plus de cinq ans, et le dernier a lieu à l'année 50. Ce calendrier reste au moins aussi dense que le minimum de cinq ans des standards. Variante ajoutée (ajustement C), retenue par Cédric PLANTAZ le 24/10/2026 ; soumise au conseil (décision DC6).</w:t>
       </w:r>
     </w:p>
     <w:p>
@@ -6244,7 +6198,7 @@
           <w:rFonts w:ascii="Calibri" w:hAnsi="Calibri"/>
           <w:sz w:val="20"/>
         </w:rPr>
-        <w:t>Catégorie : valeur de secours. L'écologue qui relève le site est inscrit sur la liste du registre, n'a ni conçu ni réalisé le projet et n'a aucun lien d'intérêt avec le porteur. Règle d'indépendance usuelle des vérifications par tiers (BCA, principe 10), étendue à celui qui produit les données.</w:t>
+        <w:t>Catégorie : valeur de secours. L'écologue qui relève le site est inscrit sur la liste du registre. S'il n'a ni conçu ni réalisé le projet et n'a aucun lien d'intérêt avec le porteur, le vérificateur visite le site selon la règle générale (9.3). S'il a conçu le projet ou accompagne le porteur, notamment comme Biodiversity Partner d'une opération certifiée, son relevé est admis à deux conditions : le vérificateur visite le site à chaque vérification, et il relève lui-même au moins une unité sur cinq, et au moins deux, tirées au sort parmi celles qui portent le plus de valeur ; si l'écart entre son score et celui de l'écologue dépasse une classe de la grille d'état sur plus d'une unité contrôlée, le vérificateur relève toutes les unités et ses scores remplacent ceux du relevé. Dans tous les cas, l'écologue n'a aucun intérêt au nombre de crédits émis. Les standards (BCA, principe 10) imposent l'indépendance du vérificateur, pas celle de celui qui produit les données ; la règle d'origine, qui l'étendait à l'écologue, écartait le Biodiversity Partner, qui connaît le mieux le site. Le contrôle sur place par échantillonnage reporte l'exigence d'indépendance sur le vérificateur. Règle modifiée (ajustement B), retenue par Cédric PLANTAZ le 24/10/2026 ; soumise au conseil (décision DC11).</w:t>
       </w:r>
     </w:p>
     <w:p>

</xml_diff>